<commit_message>
Modification du cahier de charge
</commit_message>
<xml_diff>
--- a/Docs/cahier des charges.docx
+++ b/Docs/cahier des charges.docx
@@ -314,13 +314,8 @@
           </w:tcPr>
           <w:p>
             <w:r>
-              <w:t xml:space="preserve">Création du document, contexte, </w:t>
-            </w:r>
-            <w:proofErr w:type="spellStart"/>
-            <w:r>
-              <w:t>problemes</w:t>
-            </w:r>
-            <w:proofErr w:type="spellEnd"/>
+              <w:t>Création du document, contexte, problemes</w:t>
+            </w:r>
           </w:p>
         </w:tc>
       </w:tr>
@@ -350,27 +345,9 @@
             <w:tcW w:w="4784" w:type="dxa"/>
           </w:tcPr>
           <w:p>
-            <w:proofErr w:type="spellStart"/>
-            <w:r>
-              <w:t>Technologien</w:t>
-            </w:r>
-            <w:proofErr w:type="spellEnd"/>
-            <w:r>
-              <w:t xml:space="preserve"> </w:t>
-            </w:r>
-            <w:proofErr w:type="spellStart"/>
-            <w:r>
-              <w:t>utilisees</w:t>
-            </w:r>
-            <w:proofErr w:type="spellEnd"/>
-            <w:r>
-              <w:t xml:space="preserve">, partie de </w:t>
-            </w:r>
-            <w:proofErr w:type="spellStart"/>
-            <w:r>
-              <w:t>fonctionnalites</w:t>
-            </w:r>
-            <w:proofErr w:type="spellEnd"/>
+            <w:r>
+              <w:t>Technologien utilisees, partie de fonctionnalites</w:t>
+            </w:r>
           </w:p>
         </w:tc>
       </w:tr>
@@ -1297,15 +1274,7 @@
           </w:tcPr>
           <w:p>
             <w:r>
-              <w:t>Priorité (</w:t>
-            </w:r>
-            <w:proofErr w:type="spellStart"/>
-            <w:r>
-              <w:t>MoSCoW</w:t>
-            </w:r>
-            <w:proofErr w:type="spellEnd"/>
-            <w:r>
-              <w:t>)</w:t>
+              <w:t>Priorité (MoSCoW)</w:t>
             </w:r>
           </w:p>
         </w:tc>
@@ -1347,7 +1316,7 @@
           </w:tcPr>
           <w:p>
             <w:r>
-              <w:t>À définir</w:t>
+              <w:t>Must</w:t>
             </w:r>
           </w:p>
         </w:tc>
@@ -1390,7 +1359,7 @@
           </w:tcPr>
           <w:p>
             <w:r>
-              <w:t>À définir</w:t>
+              <w:t>Must</w:t>
             </w:r>
           </w:p>
         </w:tc>
@@ -1432,7 +1401,7 @@
           </w:tcPr>
           <w:p>
             <w:r>
-              <w:t>À définir</w:t>
+              <w:t>Should</w:t>
             </w:r>
           </w:p>
         </w:tc>
@@ -1474,7 +1443,7 @@
           </w:tcPr>
           <w:p>
             <w:r>
-              <w:t>À définir</w:t>
+              <w:t>Must</w:t>
             </w:r>
           </w:p>
         </w:tc>
@@ -1516,7 +1485,7 @@
           </w:tcPr>
           <w:p>
             <w:r>
-              <w:t>À définir</w:t>
+              <w:t>Must</w:t>
             </w:r>
           </w:p>
         </w:tc>
@@ -1558,7 +1527,7 @@
           </w:tcPr>
           <w:p>
             <w:r>
-              <w:t>À définir</w:t>
+              <w:t>Must</w:t>
             </w:r>
           </w:p>
         </w:tc>
@@ -1600,7 +1569,7 @@
           </w:tcPr>
           <w:p>
             <w:r>
-              <w:t>À définir</w:t>
+              <w:t>Must</w:t>
             </w:r>
           </w:p>
         </w:tc>
@@ -1642,7 +1611,7 @@
           </w:tcPr>
           <w:p>
             <w:r>
-              <w:t>À définir</w:t>
+              <w:t>Must</w:t>
             </w:r>
           </w:p>
         </w:tc>
@@ -1684,7 +1653,7 @@
           </w:tcPr>
           <w:p>
             <w:r>
-              <w:t>À définir</w:t>
+              <w:t>Should</w:t>
             </w:r>
           </w:p>
         </w:tc>
@@ -1726,7 +1695,7 @@
           </w:tcPr>
           <w:p>
             <w:r>
-              <w:t>À définir</w:t>
+              <w:t>Could</w:t>
             </w:r>
           </w:p>
         </w:tc>
@@ -1773,7 +1742,7 @@
           <w:p>
             <w:r>
               <w:lastRenderedPageBreak/>
-              <w:t>À définir</w:t>
+              <w:t>Must</w:t>
             </w:r>
           </w:p>
         </w:tc>
@@ -1815,7 +1784,7 @@
           </w:tcPr>
           <w:p>
             <w:r>
-              <w:t>À définir</w:t>
+              <w:t>Could</w:t>
             </w:r>
           </w:p>
         </w:tc>
@@ -1856,36 +1825,23 @@
               <w:t>,</w:t>
             </w:r>
             <w:r>
-              <w:t xml:space="preserve"> </w:t>
-            </w:r>
-            <w:proofErr w:type="spellStart"/>
-            <w:r>
-              <w:t>detecttion</w:t>
-            </w:r>
-            <w:proofErr w:type="spellEnd"/>
-            <w:r>
-              <w:t xml:space="preserve"> de la connexion et </w:t>
+              <w:t xml:space="preserve"> detecttion de la connexion et </w:t>
             </w:r>
             <w:r>
               <w:t>synchronisation</w:t>
             </w:r>
             <w:r>
-              <w:t xml:space="preserve"> au retour du </w:t>
-            </w:r>
-            <w:proofErr w:type="spellStart"/>
-            <w:r>
-              <w:t>reseau</w:t>
-            </w:r>
-            <w:proofErr w:type="spellEnd"/>
-          </w:p>
-        </w:tc>
-        <w:tc>
-          <w:tcPr>
-            <w:tcW w:w="2340" w:type="dxa"/>
-          </w:tcPr>
-          <w:p>
-            <w:r>
-              <w:t>À définir</w:t>
+              <w:t xml:space="preserve"> au retour du reseau</w:t>
+            </w:r>
+          </w:p>
+        </w:tc>
+        <w:tc>
+          <w:tcPr>
+            <w:tcW w:w="2340" w:type="dxa"/>
+          </w:tcPr>
+          <w:p>
+            <w:r>
+              <w:t>Must</w:t>
             </w:r>
           </w:p>
         </w:tc>
@@ -1927,7 +1883,7 @@
           </w:tcPr>
           <w:p>
             <w:r>
-              <w:t>À définir</w:t>
+              <w:t>Should</w:t>
             </w:r>
           </w:p>
         </w:tc>
@@ -1969,7 +1925,7 @@
           </w:tcPr>
           <w:p>
             <w:r>
-              <w:t>À définir</w:t>
+              <w:t>Could</w:t>
             </w:r>
           </w:p>
         </w:tc>
@@ -2011,7 +1967,7 @@
           </w:tcPr>
           <w:p>
             <w:r>
-              <w:t>À définir</w:t>
+              <w:t>Should</w:t>
             </w:r>
           </w:p>
         </w:tc>
@@ -2208,15 +2164,7 @@
               <w:t>Saisie possible hors ligne sur les sites isolés</w:t>
             </w:r>
             <w:r>
-              <w:t xml:space="preserve">(offline first : Service </w:t>
-            </w:r>
-            <w:proofErr w:type="spellStart"/>
-            <w:r>
-              <w:t>Worker,IndexedDB</w:t>
-            </w:r>
-            <w:proofErr w:type="spellEnd"/>
-            <w:r>
-              <w:t>)</w:t>
+              <w:t>(offline first : Service Worker,IndexedDB)</w:t>
             </w:r>
             <w:r>
               <w:t>, avec synchronisation au retour de la connexion</w:t>
@@ -2263,23 +2211,7 @@
           </w:tcPr>
           <w:p>
             <w:r>
-              <w:t>Export dans des formats standards ; API REST documentée (</w:t>
-            </w:r>
-            <w:proofErr w:type="spellStart"/>
-            <w:r>
-              <w:t>Swagger</w:t>
-            </w:r>
-            <w:proofErr w:type="spellEnd"/>
-            <w:r>
-              <w:t>/</w:t>
-            </w:r>
-            <w:proofErr w:type="spellStart"/>
-            <w:r>
-              <w:t>OpenAPI</w:t>
-            </w:r>
-            <w:proofErr w:type="spellEnd"/>
-            <w:r>
-              <w:t>)</w:t>
+              <w:t>Export dans des formats standards ; API REST documentée (Swagger/OpenAPI)</w:t>
             </w:r>
           </w:p>
         </w:tc>
@@ -2360,24 +2292,10 @@
         <w:t xml:space="preserve"> </w:t>
       </w:r>
       <w:r>
-        <w:t>technologies retenues (Vue.js, Spring Boot, PostgreSQL</w:t>
-      </w:r>
-      <w:r>
-        <w:t>, Python</w:t>
-      </w:r>
-      <w:r>
-        <w:t>) ; collecte sur des sites isolés, sans connexion</w:t>
-      </w:r>
-      <w:r>
-        <w:t xml:space="preserve"> ; la saisi hors ligne doit se faire dans le </w:t>
-      </w:r>
-      <w:proofErr w:type="spellStart"/>
-      <w:r>
-        <w:t>meme</w:t>
-      </w:r>
-      <w:proofErr w:type="spellEnd"/>
-      <w:r>
-        <w:t xml:space="preserve"> navigateur que celui utilise pour la connexion initiale</w:t>
+        <w:t>technologies retenues (Vue.js, Spring Boot, PostgreSQL, Python) ; collecte sur des sites isolés, sans connexion</w:t>
+      </w:r>
+      <w:r>
+        <w:t> ; la saisi hors ligne doit se faire dans le meme navigateur que celui utilise pour la connexion initiale</w:t>
       </w:r>
     </w:p>
     <w:p>
@@ -2416,13 +2334,8 @@
         <w:t xml:space="preserve"> </w:t>
       </w:r>
       <w:r>
-        <w:t xml:space="preserve">Darwin </w:t>
-      </w:r>
-      <w:proofErr w:type="spellStart"/>
-      <w:r>
-        <w:t>Core</w:t>
-      </w:r>
-      <w:proofErr w:type="spellEnd"/>
+        <w:t>Darwin Core</w:t>
+      </w:r>
     </w:p>
     <w:p>
       <w:pPr>
@@ -2442,23 +2355,7 @@
     </w:p>
     <w:p>
       <w:r>
-        <w:t xml:space="preserve">Architecture client-serveur : l'application web (Vue.js) et l'application mobile (Ionic + Vue.js) communiquent par API REST avec le backend Spring Boot. Le backend s'appuie sur PostgreSQL pour les données, </w:t>
-      </w:r>
-      <w:proofErr w:type="spellStart"/>
-      <w:r>
-        <w:t>MinIO</w:t>
-      </w:r>
-      <w:proofErr w:type="spellEnd"/>
-      <w:r>
-        <w:t xml:space="preserve"> pour les fichiers et Redis pour le cache et les tâches longues. Les imports passent par un module ETL en Python (pandas) et les notifications en temps réel par </w:t>
-      </w:r>
-      <w:proofErr w:type="spellStart"/>
-      <w:r>
-        <w:t>WebSocket</w:t>
-      </w:r>
-      <w:proofErr w:type="spellEnd"/>
-      <w:r>
-        <w:t>/STOMP.</w:t>
+        <w:t>Architecture client-serveur : l'application web (Vue.js) et l'application mobile (Ionic + Vue.js) communiquent par API REST avec le backend Spring Boot. Le backend s'appuie sur PostgreSQL pour les données, MinIO pour les fichiers et Redis pour le cache et les tâches longues. Les imports passent par un module ETL en Python (pandas) et les notifications en temps réel par WebSocket/STOMP.</w:t>
       </w:r>
     </w:p>
     <w:p>
@@ -2601,13 +2498,8 @@
           </w:tcPr>
           <w:p>
             <w:r>
-              <w:t xml:space="preserve">Service </w:t>
-            </w:r>
-            <w:proofErr w:type="spellStart"/>
-            <w:r>
-              <w:t>Worker</w:t>
-            </w:r>
-            <w:proofErr w:type="spellEnd"/>
+              <w:t>Service Worker</w:t>
+            </w:r>
           </w:p>
         </w:tc>
         <w:tc>
@@ -2628,28 +2520,18 @@
           </w:tcPr>
           <w:p>
             <w:r>
-              <w:t xml:space="preserve">Base de </w:t>
-            </w:r>
-            <w:proofErr w:type="spellStart"/>
-            <w:r>
-              <w:t>donnees</w:t>
-            </w:r>
-            <w:proofErr w:type="spellEnd"/>
-            <w:r>
-              <w:t xml:space="preserve"> locale</w:t>
-            </w:r>
-          </w:p>
-        </w:tc>
-        <w:tc>
-          <w:tcPr>
-            <w:tcW w:w="3120" w:type="dxa"/>
-          </w:tcPr>
-          <w:p>
-            <w:proofErr w:type="spellStart"/>
+              <w:t>Base de donnees locale</w:t>
+            </w:r>
+          </w:p>
+        </w:tc>
+        <w:tc>
+          <w:tcPr>
+            <w:tcW w:w="3120" w:type="dxa"/>
+          </w:tcPr>
+          <w:p>
             <w:r>
               <w:t>IndexedDB</w:t>
             </w:r>
-            <w:proofErr w:type="spellEnd"/>
             <w:r>
               <w:t xml:space="preserve"> + Dexi</w:t>
             </w:r>
@@ -2664,36 +2546,12 @@
           </w:tcPr>
           <w:p>
             <w:r>
-              <w:t xml:space="preserve">Stocker les </w:t>
-            </w:r>
-            <w:proofErr w:type="spellStart"/>
-            <w:r>
-              <w:t>donnees</w:t>
-            </w:r>
-            <w:proofErr w:type="spellEnd"/>
-            <w:r>
-              <w:t xml:space="preserve"> saisi hors  ligne dans le navigateur</w:t>
-            </w:r>
-          </w:p>
-          <w:p>
-            <w:r>
-              <w:t>Simplifier l’</w:t>
-            </w:r>
-            <w:proofErr w:type="spellStart"/>
-            <w:r>
-              <w:t>acces</w:t>
-            </w:r>
-            <w:proofErr w:type="spellEnd"/>
-            <w:r>
-              <w:t xml:space="preserve"> a </w:t>
-            </w:r>
-            <w:proofErr w:type="spellStart"/>
-            <w:r>
-              <w:t>IndexedDB</w:t>
-            </w:r>
-            <w:proofErr w:type="spellEnd"/>
-            <w:r>
-              <w:t xml:space="preserve"> avec Dexie.js</w:t>
+              <w:t>Stocker les donnees saisi hors  ligne dans le navigateur</w:t>
+            </w:r>
+          </w:p>
+          <w:p>
+            <w:r>
+              <w:t>Simplifier l’acces a IndexedDB avec Dexie.js</w:t>
             </w:r>
           </w:p>
         </w:tc>
@@ -2810,11 +2668,9 @@
             <w:tcW w:w="3120" w:type="dxa"/>
           </w:tcPr>
           <w:p>
-            <w:proofErr w:type="spellStart"/>
             <w:r>
               <w:t>MinIO</w:t>
             </w:r>
-            <w:proofErr w:type="spellEnd"/>
           </w:p>
         </w:tc>
         <w:tc>
@@ -2908,13 +2764,8 @@
             <w:tcW w:w="3120" w:type="dxa"/>
           </w:tcPr>
           <w:p>
-            <w:proofErr w:type="spellStart"/>
-            <w:r>
-              <w:t>WebSocket</w:t>
-            </w:r>
-            <w:proofErr w:type="spellEnd"/>
-            <w:r>
-              <w:t>/STOMP</w:t>
+            <w:r>
+              <w:t>WebSocket/STOMP</w:t>
             </w:r>
           </w:p>
         </w:tc>
@@ -2977,34 +2828,19 @@
             <w:tcW w:w="3120" w:type="dxa"/>
           </w:tcPr>
           <w:p>
-            <w:proofErr w:type="spellStart"/>
-            <w:r>
-              <w:t>Swagger</w:t>
-            </w:r>
-            <w:proofErr w:type="spellEnd"/>
-            <w:r>
-              <w:t>/</w:t>
-            </w:r>
-            <w:proofErr w:type="spellStart"/>
-            <w:r>
-              <w:t>OpenAPI</w:t>
-            </w:r>
-            <w:proofErr w:type="spellEnd"/>
-          </w:p>
-        </w:tc>
-        <w:tc>
-          <w:tcPr>
-            <w:tcW w:w="3120" w:type="dxa"/>
-          </w:tcPr>
-          <w:p>
-            <w:r>
-              <w:t xml:space="preserve">Documentation et test des </w:t>
-            </w:r>
-            <w:proofErr w:type="spellStart"/>
-            <w:r>
-              <w:t>endpoints</w:t>
-            </w:r>
-            <w:proofErr w:type="spellEnd"/>
+            <w:r>
+              <w:t>Swagger/OpenAPI</w:t>
+            </w:r>
+          </w:p>
+        </w:tc>
+        <w:tc>
+          <w:tcPr>
+            <w:tcW w:w="3120" w:type="dxa"/>
+          </w:tcPr>
+          <w:p>
+            <w:r>
+              <w:t>Documentation et test des endpoints</w:t>
+            </w:r>
           </w:p>
         </w:tc>
       </w:tr>
@@ -3046,11 +2882,9 @@
             <w:tcW w:w="3120" w:type="dxa"/>
           </w:tcPr>
           <w:p>
-            <w:proofErr w:type="spellStart"/>
             <w:r>
               <w:t>Versionnement</w:t>
             </w:r>
-            <w:proofErr w:type="spellEnd"/>
           </w:p>
         </w:tc>
         <w:tc>
@@ -3262,13 +3096,8 @@
               <w:t>Cahier des charges, maquettes</w:t>
             </w:r>
             <w:r>
-              <w:t xml:space="preserve">, Conception de la base de </w:t>
-            </w:r>
-            <w:proofErr w:type="spellStart"/>
-            <w:r>
-              <w:t>donnees</w:t>
-            </w:r>
-            <w:proofErr w:type="spellEnd"/>
+              <w:t>, Conception de la base de donnees</w:t>
+            </w:r>
           </w:p>
         </w:tc>
         <w:tc>
@@ -3825,6 +3654,7 @@
         <w:docPartUnique/>
       </w:docPartObj>
     </w:sdtPr>
+    <w:sdtEndPr/>
     <w:sdtContent>
       <w:p>
         <w:pPr>

</xml_diff>